<commit_message>
day 5 full completed
i completed day 5 completely
</commit_message>
<xml_diff>
--- a/📘 Volume 1 – Python (30 Days) ✅/Chapter 1 (Days 1–5) ✅/THE_PLACEMENT_BIBLE_Volume1_Chapter1_Improved_v2.docx
+++ b/📘 Volume 1 – Python (30 Days) ✅/Chapter 1 (Days 1–5) ✅/THE_PLACEMENT_BIBLE_Volume1_Chapter1_Improved_v2.docx
@@ -1,6 +1,6 @@
 
 <file path=word/document.xml><?xml version="1.0" encoding="utf-8"?>
-<w:document xmlns:wpc="http://schemas.microsoft.com/office/word/2010/wordprocessingCanvas" xmlns:mc="http://schemas.openxmlformats.org/markup-compatibility/2006" xmlns:o="urn:schemas-microsoft-com:office:office" xmlns:r="http://schemas.openxmlformats.org/officeDocument/2006/relationships" xmlns:m="http://schemas.openxmlformats.org/officeDocument/2006/math" xmlns:v="urn:schemas-microsoft-com:vml" xmlns:wp14="http://schemas.microsoft.com/office/word/2010/wordprocessingDrawing" xmlns:wp="http://schemas.openxmlformats.org/drawingml/2006/wordprocessingDrawing" xmlns:w="http://schemas.openxmlformats.org/wordprocessingml/2006/main" xmlns:w14="http://schemas.microsoft.com/office/word/2010/wordml" xmlns:w10="urn:schemas-microsoft-com:office:word" xmlns:w15="http://schemas.microsoft.com/office/word/2012/wordml" xmlns:wpg="http://schemas.microsoft.com/office/word/2010/wordprocessingGroup" xmlns:wpi="http://schemas.microsoft.com/office/word/2010/wordprocessingInk" xmlns:wne="http://schemas.microsoft.com/office/word/2006/wordml" xmlns:wps="http://schemas.microsoft.com/office/word/2010/wordprocessingShape" xmlns:wpsCustomData="http://www.wps.cn/officeDocument/2013/wpsCustomData" mc:Ignorable="w14 w15 wp14">
+<w:document xmlns:wpc="http://schemas.microsoft.com/office/word/2010/wordprocessingCanvas" xmlns:cx="http://schemas.microsoft.com/office/drawing/2014/chartex" xmlns:cx1="http://schemas.microsoft.com/office/drawing/2015/9/8/chartex" xmlns:cx2="http://schemas.microsoft.com/office/drawing/2015/10/21/chartex" xmlns:cx3="http://schemas.microsoft.com/office/drawing/2016/5/9/chartex" xmlns:cx4="http://schemas.microsoft.com/office/drawing/2016/5/10/chartex" xmlns:cx5="http://schemas.microsoft.com/office/drawing/2016/5/11/chartex" xmlns:cx6="http://schemas.microsoft.com/office/drawing/2016/5/12/chartex" xmlns:cx7="http://schemas.microsoft.com/office/drawing/2016/5/13/chartex" xmlns:cx8="http://schemas.microsoft.com/office/drawing/2016/5/14/chartex" xmlns:mc="http://schemas.openxmlformats.org/markup-compatibility/2006" xmlns:o="urn:schemas-microsoft-com:office:office" xmlns:r="http://schemas.openxmlformats.org/officeDocument/2006/relationships" xmlns:m="http://schemas.openxmlformats.org/officeDocument/2006/math" xmlns:v="urn:schemas-microsoft-com:vml" xmlns:wp14="http://schemas.microsoft.com/office/word/2010/wordprocessingDrawing" xmlns:wp="http://schemas.openxmlformats.org/drawingml/2006/wordprocessingDrawing" xmlns:w="http://schemas.openxmlformats.org/wordprocessingml/2006/main" xmlns:w14="http://schemas.microsoft.com/office/word/2010/wordml" xmlns:w10="urn:schemas-microsoft-com:office:word" xmlns:w15="http://schemas.microsoft.com/office/word/2012/wordml" xmlns:wpg="http://schemas.microsoft.com/office/word/2010/wordprocessingGroup" xmlns:wpi="http://schemas.microsoft.com/office/word/2010/wordprocessingInk" xmlns:wne="http://schemas.microsoft.com/office/word/2006/wordml" xmlns:wps="http://schemas.microsoft.com/office/word/2010/wordprocessingShape" xmlns:wpsCustomData="http://www.wps.cn/officeDocument/2013/wpsCustomData" mc:Ignorable="w14 w15 wp14">
   <w:body>
     <w:p>
       <w:pPr>
@@ -97,12 +97,6 @@
             <w:insideH w:val="single" w:color="auto" w:sz="4" w:space="0"/>
             <w:insideV w:val="single" w:color="auto" w:sz="4" w:space="0"/>
           </w:tblBorders>
-          <w:tblCellMar>
-            <w:top w:w="0" w:type="dxa"/>
-            <w:left w:w="108" w:type="dxa"/>
-            <w:bottom w:w="0" w:type="dxa"/>
-            <w:right w:w="108" w:type="dxa"/>
-          </w:tblCellMar>
         </w:tblPrEx>
         <w:tc>
           <w:tcPr>
@@ -585,13 +579,8 @@
               <w:br w:type="textWrapping"/>
             </w:r>
             <w:r>
-              <w:t>Commit:</w:t>
-            </w:r>
-            <w:bookmarkStart w:id="0" w:name="_GoBack"/>
-            <w:r>
-              <w:t xml:space="preserve"> 'Day 1 (Mon 13 Jul) Completed'</w:t>
-            </w:r>
-            <w:bookmarkEnd w:id="0"/>
+              <w:t>Commit: 'Day 1 (Mon 13 Jul) Completed'</w:t>
+            </w:r>
           </w:p>
         </w:tc>
       </w:tr>
@@ -3895,7 +3884,7 @@
     <w:lsdException w:uiPriority="99" w:name="endnote reference"/>
     <w:lsdException w:uiPriority="99" w:name="endnote text"/>
     <w:lsdException w:uiPriority="99" w:name="table of authorities"/>
-    <w:lsdException w:uiPriority="99" w:semiHidden="0" w:name="macro"/>
+    <w:lsdException w:qFormat="1" w:uiPriority="99" w:semiHidden="0" w:name="macro"/>
     <w:lsdException w:uiPriority="99" w:name="toa heading"/>
     <w:lsdException w:uiPriority="99" w:semiHidden="0" w:name="List"/>
     <w:lsdException w:uiPriority="99" w:semiHidden="0" w:name="List Bullet"/>
@@ -3908,8 +3897,8 @@
     <w:lsdException w:uiPriority="99" w:semiHidden="0" w:name="List Bullet 3"/>
     <w:lsdException w:uiPriority="99" w:name="List Bullet 4"/>
     <w:lsdException w:uiPriority="99" w:name="List Bullet 5"/>
-    <w:lsdException w:uiPriority="99" w:semiHidden="0" w:name="List Number 2"/>
-    <w:lsdException w:uiPriority="99" w:semiHidden="0" w:name="List Number 3"/>
+    <w:lsdException w:qFormat="1" w:uiPriority="99" w:semiHidden="0" w:name="List Number 2"/>
+    <w:lsdException w:qFormat="1" w:uiPriority="99" w:semiHidden="0" w:name="List Number 3"/>
     <w:lsdException w:uiPriority="99" w:name="List Number 4"/>
     <w:lsdException w:uiPriority="99" w:name="List Number 5"/>
     <w:lsdException w:qFormat="1" w:unhideWhenUsed="0" w:uiPriority="10" w:semiHidden="0" w:name="Title"/>
@@ -4589,6 +4578,7 @@
     <w:name w:val="List Number 2"/>
     <w:basedOn w:val="1"/>
     <w:unhideWhenUsed/>
+    <w:qFormat/>
     <w:uiPriority w:val="99"/>
     <w:pPr>
       <w:numPr>
@@ -4602,6 +4592,7 @@
     <w:name w:val="List Number 3"/>
     <w:basedOn w:val="1"/>
     <w:unhideWhenUsed/>
+    <w:qFormat/>
     <w:uiPriority w:val="99"/>
     <w:pPr>
       <w:numPr>
@@ -4615,6 +4606,7 @@
     <w:name w:val="macro"/>
     <w:link w:val="147"/>
     <w:unhideWhenUsed/>
+    <w:qFormat/>
     <w:uiPriority w:val="99"/>
     <w:pPr>
       <w:tabs>

</xml_diff>